<commit_message>
changing eval library: EvalEx -> Apache Jexl
</commit_message>
<xml_diff>
--- a/src/main/resources/tabela_componentes_optativos_e_eletivos.docx
+++ b/src/main/resources/tabela_componentes_optativos_e_eletivos.docx
@@ -17,12 +17,12 @@
       </w:tblPr>
       <w:tblGrid>
         <w:gridCol w:w="960"/>
-        <w:gridCol w:w="1635"/>
-        <w:gridCol w:w="1140"/>
-        <w:gridCol w:w="1185"/>
-        <w:gridCol w:w="1140"/>
-        <w:gridCol w:w="1365"/>
-        <w:gridCol w:w="1635"/>
+        <w:gridCol w:w="1634"/>
+        <w:gridCol w:w="1141"/>
+        <w:gridCol w:w="1184"/>
+        <w:gridCol w:w="1141"/>
+        <w:gridCol w:w="1364"/>
+        <w:gridCol w:w="1636"/>
       </w:tblGrid>
       <w:tr>
         <w:trPr/>
@@ -107,7 +107,7 @@
         </w:tc>
         <w:tc>
           <w:tcPr>
-            <w:tcW w:w="1635" w:type="dxa"/>
+            <w:tcW w:w="1634" w:type="dxa"/>
             <w:vMerge w:val="restart"/>
             <w:tcBorders>
               <w:top w:val="single" w:sz="8" w:space="0" w:color="000000"/>
@@ -188,7 +188,7 @@
         </w:tc>
         <w:tc>
           <w:tcPr>
-            <w:tcW w:w="1140" w:type="dxa"/>
+            <w:tcW w:w="1141" w:type="dxa"/>
             <w:vMerge w:val="restart"/>
             <w:tcBorders>
               <w:top w:val="single" w:sz="8" w:space="0" w:color="000000"/>
@@ -302,7 +302,7 @@
         </w:tc>
         <w:tc>
           <w:tcPr>
-            <w:tcW w:w="1365" w:type="dxa"/>
+            <w:tcW w:w="1364" w:type="dxa"/>
             <w:vMerge w:val="restart"/>
             <w:tcBorders>
               <w:top w:val="single" w:sz="8" w:space="0" w:color="000000"/>
@@ -381,7 +381,7 @@
         </w:tc>
         <w:tc>
           <w:tcPr>
-            <w:tcW w:w="1635" w:type="dxa"/>
+            <w:tcW w:w="1636" w:type="dxa"/>
             <w:vMerge w:val="restart"/>
             <w:tcBorders>
               <w:top w:val="single" w:sz="8" w:space="0" w:color="000000"/>
@@ -472,7 +472,7 @@
         </w:tc>
         <w:tc>
           <w:tcPr>
-            <w:tcW w:w="1635" w:type="dxa"/>
+            <w:tcW w:w="1634" w:type="dxa"/>
             <w:vMerge w:val="continue"/>
             <w:tcBorders>
               <w:left w:val="single" w:sz="8" w:space="0" w:color="000000"/>
@@ -524,7 +524,7 @@
         </w:tc>
         <w:tc>
           <w:tcPr>
-            <w:tcW w:w="1140" w:type="dxa"/>
+            <w:tcW w:w="1141" w:type="dxa"/>
             <w:vMerge w:val="continue"/>
             <w:tcBorders>
               <w:left w:val="single" w:sz="8" w:space="0" w:color="000000"/>
@@ -576,7 +576,7 @@
         </w:tc>
         <w:tc>
           <w:tcPr>
-            <w:tcW w:w="1185" w:type="dxa"/>
+            <w:tcW w:w="1184" w:type="dxa"/>
             <w:tcBorders>
               <w:left w:val="single" w:sz="8" w:space="0" w:color="000000"/>
               <w:bottom w:val="single" w:sz="8" w:space="0" w:color="000000"/>
@@ -603,13 +603,13 @@
                 <w:sz w:val="24"/>
                 <w:szCs w:val="24"/>
               </w:rPr>
-              <w:t>h/a</w:t>
-            </w:r>
-          </w:p>
-        </w:tc>
-        <w:tc>
-          <w:tcPr>
-            <w:tcW w:w="1140" w:type="dxa"/>
+              <w:t>H/A</w:t>
+            </w:r>
+          </w:p>
+        </w:tc>
+        <w:tc>
+          <w:tcPr>
+            <w:tcW w:w="1141" w:type="dxa"/>
             <w:tcBorders>
               <w:left w:val="single" w:sz="8" w:space="0" w:color="000000"/>
               <w:bottom w:val="single" w:sz="8" w:space="0" w:color="000000"/>
@@ -636,13 +636,13 @@
                 <w:sz w:val="24"/>
                 <w:szCs w:val="24"/>
               </w:rPr>
-              <w:t>h/r</w:t>
-            </w:r>
-          </w:p>
-        </w:tc>
-        <w:tc>
-          <w:tcPr>
-            <w:tcW w:w="1365" w:type="dxa"/>
+              <w:t>H/R</w:t>
+            </w:r>
+          </w:p>
+        </w:tc>
+        <w:tc>
+          <w:tcPr>
+            <w:tcW w:w="1364" w:type="dxa"/>
             <w:vMerge w:val="continue"/>
             <w:tcBorders>
               <w:left w:val="single" w:sz="8" w:space="0" w:color="000000"/>
@@ -694,7 +694,7 @@
         </w:tc>
         <w:tc>
           <w:tcPr>
-            <w:tcW w:w="1635" w:type="dxa"/>
+            <w:tcW w:w="1636" w:type="dxa"/>
             <w:vMerge w:val="continue"/>
             <w:tcBorders>
               <w:left w:val="single" w:sz="8" w:space="0" w:color="000000"/>
@@ -802,7 +802,7 @@
         </w:tc>
         <w:tc>
           <w:tcPr>
-            <w:tcW w:w="1635" w:type="dxa"/>
+            <w:tcW w:w="1634" w:type="dxa"/>
             <w:tcBorders>
               <w:left w:val="single" w:sz="8" w:space="0" w:color="000000"/>
               <w:bottom w:val="single" w:sz="8" w:space="0" w:color="000000"/>
@@ -854,7 +854,7 @@
         </w:tc>
         <w:tc>
           <w:tcPr>
-            <w:tcW w:w="1140" w:type="dxa"/>
+            <w:tcW w:w="1141" w:type="dxa"/>
             <w:tcBorders>
               <w:left w:val="single" w:sz="8" w:space="0" w:color="000000"/>
               <w:bottom w:val="single" w:sz="8" w:space="0" w:color="000000"/>
@@ -906,7 +906,7 @@
         </w:tc>
         <w:tc>
           <w:tcPr>
-            <w:tcW w:w="1185" w:type="dxa"/>
+            <w:tcW w:w="1184" w:type="dxa"/>
             <w:tcBorders>
               <w:left w:val="single" w:sz="8" w:space="0" w:color="000000"/>
               <w:bottom w:val="single" w:sz="8" w:space="0" w:color="000000"/>
@@ -941,7 +941,7 @@
         </w:tc>
         <w:tc>
           <w:tcPr>
-            <w:tcW w:w="1140" w:type="dxa"/>
+            <w:tcW w:w="1141" w:type="dxa"/>
             <w:tcBorders>
               <w:left w:val="single" w:sz="8" w:space="0" w:color="000000"/>
               <w:bottom w:val="single" w:sz="8" w:space="0" w:color="000000"/>
@@ -976,7 +976,7 @@
         </w:tc>
         <w:tc>
           <w:tcPr>
-            <w:tcW w:w="1365" w:type="dxa"/>
+            <w:tcW w:w="1364" w:type="dxa"/>
             <w:tcBorders>
               <w:left w:val="single" w:sz="8" w:space="0" w:color="000000"/>
               <w:bottom w:val="single" w:sz="8" w:space="0" w:color="000000"/>
@@ -1028,7 +1028,7 @@
         </w:tc>
         <w:tc>
           <w:tcPr>
-            <w:tcW w:w="1635" w:type="dxa"/>
+            <w:tcW w:w="1636" w:type="dxa"/>
             <w:tcBorders>
               <w:left w:val="single" w:sz="8" w:space="0" w:color="000000"/>
               <w:bottom w:val="single" w:sz="8" w:space="0" w:color="000000"/>

</xml_diff>